<commit_message>
chore: update resume documents with latest information
</commit_message>
<xml_diff>
--- a/public/resume/Ahmad_Rizal_Resume.docx
+++ b/public/resume/Ahmad_Rizal_Resume.docx
@@ -27,7 +27,7 @@
           <w:p>
             <w:pPr>
               <w:pStyle w:val="TableParagraph"/>
-              <w:spacing w:before="24"/>
+              <w:spacing w:before="0"/>
               <w:ind w:left="112"/>
               <w:rPr>
                 <w:rFonts w:ascii="Cambria"/>
@@ -58,7 +58,7 @@
           <w:p>
             <w:pPr>
               <w:pStyle w:val="TableParagraph"/>
-              <w:spacing w:before="88"/>
+              <w:spacing w:before="0"/>
               <w:ind w:left="112"/>
               <w:rPr>
                 <w:sz w:val="20"/>
@@ -202,7 +202,7 @@
       </w:tr>
       <w:tr>
         <w:trPr>
-          <w:trHeight w:val="1429"/>
+          <w:trHeight w:val="862"/>
         </w:trPr>
         <w:tc>
           <w:tcPr>
@@ -211,7 +211,7 @@
           <w:p>
             <w:pPr>
               <w:pStyle w:val="TableParagraph"/>
-              <w:spacing w:before="229" w:line="264" w:lineRule="auto"/>
+              <w:spacing w:before="0"/>
               <w:ind w:left="112" w:right="433"/>
               <w:jc w:val="both"/>
               <w:rPr>
@@ -222,7 +222,7 @@
               <w:rPr>
                 <w:sz w:val="20"/>
               </w:rPr>
-              <w:t>Undergraduate Informatics student (Software Engineering) with hands-on experience building production-grade web and mobile applications using Next.js and Laravel. Contributed to real-world SIMRS and HRIS systems during internship, and served as lab assistant for 5 programming courses over 3 semesters. Published in a peer-reviewed journal. Actively seeking a Software Engineer Internship to apply and deepen technical skills in an industry environment.</w:t>
+              <w:t>Undergraduate Informatics student (Software Engineering) with hands-on experience building production-grade web applications using Laravel. Contributed to real-world SIMRS and HRIS systems during internship using Laravel &amp; Filament, with experience integrating REST APIs and managing multi-database environments. Served as lab assistant for 5 programming courses and published in a peer-reviewed journal. Actively seeking a Software Engineer Internship to apply and deepen backend development skills in an industry environment.</w:t>
             </w:r>
           </w:p>
         </w:tc>
@@ -261,7 +261,7 @@
           <w:p>
             <w:pPr>
               <w:pStyle w:val="TableParagraph"/>
-              <w:spacing w:before="202"/>
+              <w:spacing w:before="0"/>
               <w:ind w:left="112"/>
               <w:rPr>
                 <w:rFonts w:ascii="Cambria"/>
@@ -284,7 +284,7 @@
       </w:tr>
       <w:tr>
         <w:trPr>
-          <w:trHeight w:val="789"/>
+          <w:trHeight w:val="288"/>
         </w:trPr>
         <w:tc>
           <w:tcPr>
@@ -293,7 +293,7 @@
           <w:p>
             <w:pPr>
               <w:pStyle w:val="TableParagraph"/>
-              <w:spacing w:before="68"/>
+              <w:spacing w:before="0"/>
               <w:ind w:left="112"/>
               <w:rPr>
                 <w:sz w:val="20"/>
@@ -309,7 +309,7 @@
           <w:p>
             <w:pPr>
               <w:pStyle w:val="TableParagraph"/>
-              <w:spacing w:before="68"/>
+              <w:spacing w:before="0"/>
               <w:ind w:left="112"/>
               <w:rPr>
                 <w:b/>
@@ -347,7 +347,7 @@
           <w:p>
             <w:pPr>
               <w:pStyle w:val="TableParagraph"/>
-              <w:spacing w:before="68"/>
+              <w:spacing w:before="0"/>
               <w:ind w:left="112"/>
               <w:rPr>
                 <w:sz w:val="20"/>
@@ -420,7 +420,7 @@
               <w:tabs>
                 <w:tab w:val="left" w:pos="832"/>
               </w:tabs>
-              <w:spacing w:before="97" w:line="271" w:lineRule="auto"/>
+              <w:spacing w:before="0"/>
               <w:ind w:right="499"/>
               <w:rPr>
                 <w:sz w:val="20"/>
@@ -443,7 +443,7 @@
               <w:tabs>
                 <w:tab w:val="left" w:pos="832"/>
               </w:tabs>
-              <w:spacing w:before="97" w:line="271" w:lineRule="auto"/>
+              <w:spacing w:before="0"/>
               <w:ind w:right="499"/>
               <w:rPr>
                 <w:sz w:val="20"/>
@@ -466,7 +466,7 @@
               <w:tabs>
                 <w:tab w:val="left" w:pos="832"/>
               </w:tabs>
-              <w:spacing w:before="97" w:line="271" w:lineRule="auto"/>
+              <w:spacing w:before="0"/>
               <w:ind w:right="499"/>
               <w:rPr>
                 <w:sz w:val="20"/>
@@ -489,7 +489,7 @@
               <w:tabs>
                 <w:tab w:val="left" w:pos="832"/>
               </w:tabs>
-              <w:spacing w:before="97" w:line="271" w:lineRule="auto"/>
+              <w:spacing w:before="0"/>
               <w:ind w:right="499"/>
               <w:rPr>
                 <w:sz w:val="20"/>
@@ -506,7 +506,7 @@
       </w:tr>
       <w:tr>
         <w:trPr>
-          <w:trHeight w:val="817"/>
+          <w:trHeight w:val="217"/>
         </w:trPr>
         <w:tc>
           <w:tcPr>
@@ -515,7 +515,7 @@
           <w:p>
             <w:pPr>
               <w:pStyle w:val="TableParagraph"/>
-              <w:spacing w:before="68"/>
+              <w:spacing w:before="0"/>
               <w:ind w:left="112"/>
               <w:rPr>
                 <w:sz w:val="20"/>
@@ -545,6 +545,7 @@
           <w:p>
             <w:pPr>
               <w:pStyle w:val="TableParagraph"/>
+              <w:spacing w:before="0"/>
               <w:ind w:left="112"/>
               <w:rPr>
                 <w:rFonts w:ascii="Cambria"/>
@@ -568,6 +569,7 @@
           <w:p>
             <w:pPr>
               <w:pStyle w:val="TableParagraph"/>
+              <w:spacing w:before="0"/>
               <w:ind w:left="112"/>
               <w:rPr>
                 <w:i/>
@@ -635,7 +637,7 @@
               <w:tabs>
                 <w:tab w:val="left" w:pos="832"/>
               </w:tabs>
-              <w:spacing w:before="97" w:line="271" w:lineRule="auto"/>
+              <w:spacing w:before="0"/>
               <w:ind w:right="782"/>
               <w:rPr>
                 <w:sz w:val="20"/>
@@ -659,7 +661,7 @@
               <w:tabs>
                 <w:tab w:val="left" w:pos="832"/>
               </w:tabs>
-              <w:spacing w:before="97" w:line="271" w:lineRule="auto"/>
+              <w:spacing w:before="0"/>
               <w:ind w:right="782"/>
               <w:rPr>
                 <w:sz w:val="20"/>
@@ -685,7 +687,7 @@
           <w:p>
             <w:pPr>
               <w:pStyle w:val="TableParagraph"/>
-              <w:spacing w:before="68"/>
+              <w:spacing w:before="0"/>
               <w:ind w:left="112"/>
               <w:rPr>
                 <w:sz w:val="20"/>
@@ -701,7 +703,7 @@
           <w:p>
             <w:pPr>
               <w:pStyle w:val="TableParagraph"/>
-              <w:spacing w:before="22"/>
+              <w:spacing w:before="0"/>
               <w:ind w:left="112"/>
               <w:rPr>
                 <w:rFonts w:ascii="Cambria"/>
@@ -783,7 +785,7 @@
           <w:p>
             <w:pPr>
               <w:pStyle w:val="TableParagraph"/>
-              <w:spacing w:before="22"/>
+              <w:spacing w:before="0"/>
               <w:ind w:left="112"/>
               <w:rPr>
                 <w:rFonts w:ascii="Cambria"/>
@@ -823,16 +825,14 @@
               </w:rPr>
               <w:t xml:space="preserve"> </w:t>
             </w:r>
-            <w:proofErr w:type="spellStart"/>
             <w:r>
               <w:rPr>
                 <w:i/>
                 <w:spacing w:val="-4"/>
                 <w:sz w:val="20"/>
               </w:rPr>
-              <w:t>Maret</w:t>
-            </w:r>
-            <w:proofErr w:type="spellEnd"/>
+              <w:t>November</w:t>
+            </w:r>
             <w:r>
               <w:rPr>
                 <w:i/>
@@ -862,7 +862,7 @@
               <w:tabs>
                 <w:tab w:val="left" w:pos="832"/>
               </w:tabs>
-              <w:spacing w:before="97" w:line="271" w:lineRule="auto"/>
+              <w:spacing w:before="0"/>
               <w:ind w:right="499"/>
               <w:rPr>
                 <w:sz w:val="20"/>
@@ -911,7 +911,7 @@
           <w:p>
             <w:pPr>
               <w:pStyle w:val="TableParagraph"/>
-              <w:spacing w:before="202"/>
+              <w:spacing w:before="0"/>
               <w:ind w:left="112"/>
               <w:rPr>
                 <w:rFonts w:ascii="Cambria"/>
@@ -943,6 +943,7 @@
           <w:p>
             <w:pPr>
               <w:pStyle w:val="TableParagraph"/>
+              <w:spacing w:before="0"/>
               <w:ind w:left="112"/>
               <w:rPr>
                 <w:rFonts w:ascii="Cambria" w:hAnsi="Cambria"/>
@@ -992,6 +993,7 @@
           <w:p>
             <w:pPr>
               <w:pStyle w:val="TableParagraph"/>
+              <w:spacing w:before="0"/>
               <w:ind w:left="112"/>
               <w:rPr>
                 <w:sz w:val="20"/>
@@ -1049,7 +1051,19 @@
                 <w:rPr>
                   <w:rStyle w:val="Hyperlink"/>
                 </w:rPr>
-                <w:t>github.com/ahmadrizal1st/mora</w:t>
+                <w:t>github.com/ahmadrizal1st/mo</w:t>
+              </w:r>
+              <w:r>
+                <w:rPr>
+                  <w:rStyle w:val="Hyperlink"/>
+                </w:rPr>
+                <w:t>r</w:t>
+              </w:r>
+              <w:r>
+                <w:rPr>
+                  <w:rStyle w:val="Hyperlink"/>
+                </w:rPr>
+                <w:t>a</w:t>
               </w:r>
             </w:hyperlink>
           </w:p>
@@ -1066,6 +1080,126 @@
           <w:p>
             <w:pPr>
               <w:pStyle w:val="TableParagraph"/>
+              <w:numPr>
+                <w:ilvl w:val="0"/>
+                <w:numId w:val="7"/>
+              </w:numPr>
+              <w:tabs>
+                <w:tab w:val="left" w:pos="832"/>
+              </w:tabs>
+              <w:spacing w:before="0"/>
+              <w:ind w:right="212"/>
+              <w:rPr>
+                <w:sz w:val="20"/>
+              </w:rPr>
+            </w:pPr>
+            <w:r>
+              <w:rPr>
+                <w:sz w:val="20"/>
+              </w:rPr>
+              <w:t>Built an AI-powered fintech web app integrating OCR for automated financial document processing</w:t>
+            </w:r>
+          </w:p>
+          <w:p>
+            <w:pPr>
+              <w:pStyle w:val="TableParagraph"/>
+              <w:numPr>
+                <w:ilvl w:val="0"/>
+                <w:numId w:val="7"/>
+              </w:numPr>
+              <w:tabs>
+                <w:tab w:val="left" w:pos="832"/>
+              </w:tabs>
+              <w:spacing w:before="0"/>
+              <w:ind w:right="212"/>
+              <w:rPr>
+                <w:sz w:val="20"/>
+              </w:rPr>
+            </w:pPr>
+            <w:r>
+              <w:rPr>
+                <w:sz w:val="20"/>
+              </w:rPr>
+              <w:t xml:space="preserve">Connected multiple LLM providers (Gemini, </w:t>
+            </w:r>
+            <w:proofErr w:type="spellStart"/>
+            <w:r>
+              <w:rPr>
+                <w:sz w:val="20"/>
+              </w:rPr>
+              <w:t>Groq</w:t>
+            </w:r>
+            <w:proofErr w:type="spellEnd"/>
+            <w:r>
+              <w:rPr>
+                <w:sz w:val="20"/>
+              </w:rPr>
+              <w:t xml:space="preserve">) via AI SDK for intelligent financial </w:t>
+            </w:r>
+            <w:proofErr w:type="spellStart"/>
+            <w:r>
+              <w:rPr>
+                <w:sz w:val="20"/>
+              </w:rPr>
+              <w:t>insights</w:t>
+            </w:r>
+            <w:proofErr w:type="spellEnd"/>
+          </w:p>
+          <w:p>
+            <w:pPr>
+              <w:pStyle w:val="TableParagraph"/>
+              <w:numPr>
+                <w:ilvl w:val="0"/>
+                <w:numId w:val="7"/>
+              </w:numPr>
+              <w:tabs>
+                <w:tab w:val="left" w:pos="832"/>
+              </w:tabs>
+              <w:spacing w:before="0"/>
+              <w:ind w:right="212"/>
+              <w:rPr>
+                <w:rFonts w:ascii="Cambria" w:hAnsi="Cambria"/>
+                <w:sz w:val="20"/>
+              </w:rPr>
+            </w:pPr>
+            <w:r>
+              <w:rPr>
+                <w:rFonts w:ascii="Cambria" w:hAnsi="Cambria"/>
+                <w:sz w:val="20"/>
+              </w:rPr>
+              <w:t xml:space="preserve">Containerized full-stack architecture using Docker with </w:t>
+            </w:r>
+            <w:proofErr w:type="spellStart"/>
+            <w:r>
+              <w:rPr>
+                <w:rFonts w:ascii="Cambria" w:hAnsi="Cambria"/>
+                <w:sz w:val="20"/>
+              </w:rPr>
+              <w:t>FastAPI</w:t>
+            </w:r>
+            <w:proofErr w:type="spellEnd"/>
+            <w:r>
+              <w:rPr>
+                <w:rFonts w:ascii="Cambria" w:hAnsi="Cambria"/>
+                <w:sz w:val="20"/>
+              </w:rPr>
+              <w:t xml:space="preserve"> microservice for AI processing</w:t>
+            </w:r>
+          </w:p>
+        </w:tc>
+      </w:tr>
+      <w:tr>
+        <w:trPr>
+          <w:trHeight w:val="698"/>
+        </w:trPr>
+        <w:tc>
+          <w:tcPr>
+            <w:tcW w:w="10773" w:type="dxa"/>
+          </w:tcPr>
+          <w:p>
+            <w:pPr>
+              <w:pStyle w:val="TableParagraph"/>
+              <w:spacing w:before="0"/>
               <w:ind w:left="112"/>
               <w:rPr>
                 <w:rFonts w:ascii="Cambria" w:hAnsi="Cambria"/>
@@ -1114,6 +1248,7 @@
           <w:p>
             <w:pPr>
               <w:pStyle w:val="TableParagraph"/>
+              <w:spacing w:before="0"/>
               <w:ind w:left="112"/>
               <w:rPr>
                 <w:sz w:val="20"/>
@@ -1185,6 +1320,7 @@
           <w:p>
             <w:pPr>
               <w:pStyle w:val="TableParagraph"/>
+              <w:spacing w:before="0"/>
               <w:ind w:left="112"/>
               <w:rPr>
                 <w:sz w:val="20"/>
@@ -1235,7 +1371,7 @@
               <w:tabs>
                 <w:tab w:val="left" w:pos="832"/>
               </w:tabs>
-              <w:spacing w:before="98" w:line="271" w:lineRule="auto"/>
+              <w:spacing w:before="0"/>
               <w:ind w:right="212"/>
               <w:rPr>
                 <w:sz w:val="20"/>
@@ -1258,7 +1394,7 @@
               <w:tabs>
                 <w:tab w:val="left" w:pos="832"/>
               </w:tabs>
-              <w:spacing w:before="98" w:line="271" w:lineRule="auto"/>
+              <w:spacing w:before="0"/>
               <w:ind w:right="212"/>
               <w:rPr>
                 <w:sz w:val="20"/>
@@ -1309,7 +1445,7 @@
               <w:tabs>
                 <w:tab w:val="left" w:pos="832"/>
               </w:tabs>
-              <w:spacing w:before="98" w:line="271" w:lineRule="auto"/>
+              <w:spacing w:before="0"/>
               <w:ind w:right="212"/>
               <w:rPr>
                 <w:sz w:val="20"/>
@@ -1332,7 +1468,7 @@
               <w:tabs>
                 <w:tab w:val="left" w:pos="832"/>
               </w:tabs>
-              <w:spacing w:before="98" w:line="271" w:lineRule="auto"/>
+              <w:spacing w:before="0"/>
               <w:ind w:right="212"/>
               <w:rPr>
                 <w:sz w:val="20"/>
@@ -1372,6 +1508,7 @@
           <w:p>
             <w:pPr>
               <w:pStyle w:val="TableParagraph"/>
+              <w:spacing w:before="0"/>
               <w:ind w:left="112"/>
               <w:rPr>
                 <w:i/>
@@ -1386,7 +1523,6 @@
                 <w:bCs/>
                 <w:sz w:val="20"/>
               </w:rPr>
-              <w:lastRenderedPageBreak/>
               <w:t xml:space="preserve">HUMANIKA Organization Management System — </w:t>
             </w:r>
             <w:r>
@@ -1401,6 +1537,7 @@
           <w:p>
             <w:pPr>
               <w:pStyle w:val="TableParagraph"/>
+              <w:spacing w:before="0"/>
               <w:ind w:left="112"/>
               <w:rPr>
                 <w:rFonts w:ascii="Cambria" w:hAnsi="Cambria"/>
@@ -1418,6 +1555,7 @@
           <w:p>
             <w:pPr>
               <w:pStyle w:val="TableParagraph"/>
+              <w:spacing w:before="0"/>
               <w:ind w:left="112"/>
               <w:rPr>
                 <w:rFonts w:ascii="Cambria" w:hAnsi="Cambria"/>
@@ -1456,7 +1594,7 @@
       </w:tr>
       <w:tr>
         <w:trPr>
-          <w:trHeight w:val="1257"/>
+          <w:trHeight w:val="1475"/>
         </w:trPr>
         <w:tc>
           <w:tcPr>
@@ -1472,7 +1610,7 @@
               <w:tabs>
                 <w:tab w:val="left" w:pos="832"/>
               </w:tabs>
-              <w:spacing w:before="98" w:line="271" w:lineRule="auto"/>
+              <w:spacing w:before="0"/>
               <w:ind w:right="212"/>
               <w:rPr>
                 <w:sz w:val="20"/>
@@ -1495,7 +1633,7 @@
               <w:tabs>
                 <w:tab w:val="left" w:pos="832"/>
               </w:tabs>
-              <w:spacing w:before="98" w:line="271" w:lineRule="auto"/>
+              <w:spacing w:before="0"/>
               <w:ind w:right="212"/>
               <w:rPr>
                 <w:sz w:val="20"/>
@@ -1521,7 +1659,7 @@
           <w:p>
             <w:pPr>
               <w:pStyle w:val="TableParagraph"/>
-              <w:spacing w:before="68"/>
+              <w:spacing w:before="0"/>
               <w:ind w:left="112"/>
               <w:rPr>
                 <w:rFonts w:ascii="Cambria" w:hAnsi="Cambria"/>
@@ -1537,6 +1675,7 @@
                 <w:bCs/>
                 <w:sz w:val="20"/>
               </w:rPr>
+              <w:lastRenderedPageBreak/>
               <w:t>Keeper App</w:t>
             </w:r>
             <w:r>
@@ -1563,6 +1702,7 @@
           <w:p>
             <w:pPr>
               <w:pStyle w:val="TableParagraph"/>
+              <w:spacing w:before="0"/>
               <w:ind w:left="112"/>
               <w:rPr>
                 <w:sz w:val="20"/>
@@ -1578,6 +1718,7 @@
           <w:p>
             <w:pPr>
               <w:pStyle w:val="TableParagraph"/>
+              <w:spacing w:before="0"/>
               <w:ind w:left="112"/>
               <w:rPr>
                 <w:sz w:val="20"/>
@@ -1603,7 +1744,7 @@
       </w:tr>
       <w:tr>
         <w:trPr>
-          <w:trHeight w:val="705"/>
+          <w:trHeight w:val="147"/>
         </w:trPr>
         <w:tc>
           <w:tcPr>
@@ -1619,7 +1760,7 @@
               <w:tabs>
                 <w:tab w:val="left" w:pos="832"/>
               </w:tabs>
-              <w:spacing w:before="98" w:line="271" w:lineRule="auto"/>
+              <w:spacing w:before="0"/>
               <w:ind w:right="212"/>
               <w:rPr>
                 <w:sz w:val="20"/>
@@ -1630,277 +1771,6 @@
                 <w:sz w:val="20"/>
               </w:rPr>
               <w:t>Developed a secure mobile file storage app with offline access, real-time cloud sync via Firebase, and local caching using Room Database (SQLite) for fast offline data retrieval</w:t>
-            </w:r>
-          </w:p>
-        </w:tc>
-      </w:tr>
-      <w:tr>
-        <w:trPr>
-          <w:trHeight w:val="817"/>
-        </w:trPr>
-        <w:tc>
-          <w:tcPr>
-            <w:tcW w:w="10773" w:type="dxa"/>
-          </w:tcPr>
-          <w:p>
-            <w:pPr>
-              <w:pStyle w:val="TableParagraph"/>
-              <w:spacing w:before="68"/>
-              <w:ind w:left="112"/>
-              <w:rPr>
-                <w:rFonts w:ascii="Cambria" w:hAnsi="Cambria"/>
-                <w:b/>
-                <w:bCs/>
-                <w:sz w:val="20"/>
-              </w:rPr>
-            </w:pPr>
-            <w:r>
-              <w:rPr>
-                <w:rFonts w:ascii="Cambria" w:hAnsi="Cambria"/>
-                <w:b/>
-                <w:bCs/>
-                <w:sz w:val="20"/>
-              </w:rPr>
-              <w:t>Wijaya Kusuma Craft – Finance Dashboard</w:t>
-            </w:r>
-            <w:r>
-              <w:t xml:space="preserve"> — </w:t>
-            </w:r>
-            <w:r>
-              <w:rPr>
-                <w:i/>
-                <w:iCs/>
-                <w:sz w:val="20"/>
-              </w:rPr>
-              <w:t>Website Application | 2025</w:t>
-            </w:r>
-          </w:p>
-          <w:p>
-            <w:pPr>
-              <w:pStyle w:val="TableParagraph"/>
-              <w:ind w:left="112"/>
-              <w:rPr>
-                <w:sz w:val="20"/>
-              </w:rPr>
-            </w:pPr>
-            <w:r>
-              <w:rPr>
-                <w:sz w:val="20"/>
-              </w:rPr>
-              <w:t>Tech Stack: PHP, JavaScript, MySQL, MVC Architecture</w:t>
-            </w:r>
-          </w:p>
-          <w:p>
-            <w:pPr>
-              <w:pStyle w:val="TableParagraph"/>
-              <w:ind w:left="112"/>
-              <w:rPr>
-                <w:sz w:val="20"/>
-              </w:rPr>
-            </w:pPr>
-            <w:r>
-              <w:rPr>
-                <w:sz w:val="20"/>
-              </w:rPr>
-              <w:t xml:space="preserve">GitHub: </w:t>
-            </w:r>
-            <w:hyperlink r:id="rId14" w:history="1">
-              <w:r>
-                <w:rPr>
-                  <w:rStyle w:val="Hyperlink"/>
-                  <w:sz w:val="20"/>
-                </w:rPr>
-                <w:t>github.com/ahmadrizal1st/</w:t>
-              </w:r>
-              <w:proofErr w:type="spellStart"/>
-              <w:r>
-                <w:rPr>
-                  <w:rStyle w:val="Hyperlink"/>
-                  <w:sz w:val="20"/>
-                </w:rPr>
-                <w:t>wkc</w:t>
-              </w:r>
-              <w:proofErr w:type="spellEnd"/>
-              <w:r>
-                <w:rPr>
-                  <w:rStyle w:val="Hyperlink"/>
-                  <w:sz w:val="20"/>
-                </w:rPr>
-                <w:t>-finance-dashboard</w:t>
-              </w:r>
-            </w:hyperlink>
-          </w:p>
-        </w:tc>
-      </w:tr>
-      <w:tr>
-        <w:trPr>
-          <w:trHeight w:val="817"/>
-        </w:trPr>
-        <w:tc>
-          <w:tcPr>
-            <w:tcW w:w="10773" w:type="dxa"/>
-          </w:tcPr>
-          <w:p>
-            <w:pPr>
-              <w:pStyle w:val="TableParagraph"/>
-              <w:numPr>
-                <w:ilvl w:val="0"/>
-                <w:numId w:val="7"/>
-              </w:numPr>
-              <w:tabs>
-                <w:tab w:val="left" w:pos="832"/>
-              </w:tabs>
-              <w:spacing w:before="98" w:line="271" w:lineRule="auto"/>
-              <w:ind w:right="212"/>
-              <w:rPr>
-                <w:sz w:val="20"/>
-              </w:rPr>
-            </w:pPr>
-            <w:r>
-              <w:rPr>
-                <w:sz w:val="20"/>
-              </w:rPr>
-              <w:t>Built a web-based financial dashboard deployed and actively used by Wijaya Kusuma Craft for daily transaction tracking, financial reporting, and performance monitoring</w:t>
-            </w:r>
-          </w:p>
-          <w:p>
-            <w:pPr>
-              <w:pStyle w:val="TableParagraph"/>
-              <w:numPr>
-                <w:ilvl w:val="0"/>
-                <w:numId w:val="7"/>
-              </w:numPr>
-              <w:tabs>
-                <w:tab w:val="left" w:pos="832"/>
-              </w:tabs>
-              <w:spacing w:before="98" w:line="271" w:lineRule="auto"/>
-              <w:ind w:right="212"/>
-              <w:rPr>
-                <w:sz w:val="20"/>
-              </w:rPr>
-            </w:pPr>
-            <w:r>
-              <w:rPr>
-                <w:sz w:val="20"/>
-              </w:rPr>
-              <w:t>Applied MVC architecture for a clean and maintainable backend structure</w:t>
-            </w:r>
-          </w:p>
-        </w:tc>
-      </w:tr>
-      <w:tr>
-        <w:trPr>
-          <w:trHeight w:val="817"/>
-        </w:trPr>
-        <w:tc>
-          <w:tcPr>
-            <w:tcW w:w="10773" w:type="dxa"/>
-          </w:tcPr>
-          <w:p>
-            <w:pPr>
-              <w:pStyle w:val="TableParagraph"/>
-              <w:spacing w:before="68"/>
-              <w:ind w:left="112"/>
-              <w:rPr>
-                <w:rFonts w:ascii="Cambria" w:hAnsi="Cambria"/>
-                <w:b/>
-                <w:bCs/>
-                <w:sz w:val="20"/>
-              </w:rPr>
-            </w:pPr>
-            <w:proofErr w:type="spellStart"/>
-            <w:r>
-              <w:rPr>
-                <w:rFonts w:ascii="Cambria" w:hAnsi="Cambria"/>
-                <w:b/>
-                <w:bCs/>
-                <w:sz w:val="20"/>
-              </w:rPr>
-              <w:t>Cengkrem</w:t>
-            </w:r>
-            <w:proofErr w:type="spellEnd"/>
-            <w:r>
-              <w:t xml:space="preserve"> — </w:t>
-            </w:r>
-            <w:r>
-              <w:rPr>
-                <w:i/>
-                <w:iCs/>
-                <w:sz w:val="20"/>
-              </w:rPr>
-              <w:t>Website Application | 2024</w:t>
-            </w:r>
-          </w:p>
-          <w:p>
-            <w:pPr>
-              <w:pStyle w:val="TableParagraph"/>
-              <w:ind w:left="112"/>
-              <w:rPr>
-                <w:sz w:val="20"/>
-              </w:rPr>
-            </w:pPr>
-            <w:r>
-              <w:rPr>
-                <w:sz w:val="20"/>
-              </w:rPr>
-              <w:t>Tech Stack: WordPress, PHP, CMS</w:t>
-            </w:r>
-          </w:p>
-          <w:p>
-            <w:pPr>
-              <w:pStyle w:val="TableParagraph"/>
-              <w:ind w:left="112"/>
-              <w:rPr>
-                <w:sz w:val="20"/>
-              </w:rPr>
-            </w:pPr>
-            <w:r>
-              <w:rPr>
-                <w:sz w:val="20"/>
-              </w:rPr>
-              <w:t xml:space="preserve">Live Site: </w:t>
-            </w:r>
-            <w:hyperlink r:id="rId15" w:history="1">
-              <w:r>
-                <w:rPr>
-                  <w:rStyle w:val="Hyperlink"/>
-                  <w:sz w:val="20"/>
-                </w:rPr>
-                <w:t>cengkrem.id</w:t>
-              </w:r>
-            </w:hyperlink>
-          </w:p>
-        </w:tc>
-      </w:tr>
-      <w:tr>
-        <w:trPr>
-          <w:trHeight w:val="817"/>
-        </w:trPr>
-        <w:tc>
-          <w:tcPr>
-            <w:tcW w:w="10773" w:type="dxa"/>
-          </w:tcPr>
-          <w:p>
-            <w:pPr>
-              <w:pStyle w:val="TableParagraph"/>
-              <w:numPr>
-                <w:ilvl w:val="0"/>
-                <w:numId w:val="7"/>
-              </w:numPr>
-              <w:tabs>
-                <w:tab w:val="left" w:pos="832"/>
-              </w:tabs>
-              <w:spacing w:before="98" w:line="271" w:lineRule="auto"/>
-              <w:ind w:right="212"/>
-              <w:rPr>
-                <w:sz w:val="20"/>
-              </w:rPr>
-            </w:pPr>
-            <w:r>
-              <w:rPr>
-                <w:sz w:val="20"/>
-              </w:rPr>
-              <w:t>Developed an official company profile website with article management, product showcase, image gallery, and contact page; optimized for non-technical content managers</w:t>
             </w:r>
           </w:p>
         </w:tc>
@@ -1939,7 +1809,7 @@
           <w:p>
             <w:pPr>
               <w:pStyle w:val="TableParagraph"/>
-              <w:spacing w:before="192"/>
+              <w:spacing w:before="0"/>
               <w:rPr>
                 <w:rFonts w:ascii="Cambria"/>
                 <w:b/>
@@ -1961,7 +1831,7 @@
       </w:tr>
       <w:tr>
         <w:trPr>
-          <w:trHeight w:val="1024"/>
+          <w:trHeight w:val="74"/>
         </w:trPr>
         <w:tc>
           <w:tcPr>
@@ -1970,7 +1840,7 @@
           <w:p>
             <w:pPr>
               <w:pStyle w:val="TableParagraph"/>
-              <w:spacing w:before="77"/>
+              <w:spacing w:before="0"/>
               <w:rPr>
                 <w:rFonts w:ascii="Cambria" w:hAnsi="Cambria"/>
                 <w:b/>
@@ -2181,7 +2051,7 @@
           <w:p>
             <w:pPr>
               <w:pStyle w:val="TableParagraph"/>
-              <w:spacing w:before="77"/>
+              <w:spacing w:before="0"/>
               <w:rPr>
                 <w:w w:val="105"/>
                 <w:sz w:val="20"/>
@@ -2303,7 +2173,7 @@
           <w:p>
             <w:pPr>
               <w:pStyle w:val="TableParagraph"/>
-              <w:spacing w:before="77"/>
+              <w:spacing w:before="0"/>
               <w:rPr>
                 <w:i/>
                 <w:iCs/>
@@ -2378,7 +2248,7 @@
       </w:tblGrid>
       <w:tr>
         <w:trPr>
-          <w:trHeight w:val="173"/>
+          <w:trHeight w:val="74"/>
         </w:trPr>
         <w:tc>
           <w:tcPr>
@@ -2387,7 +2257,7 @@
           <w:p>
             <w:pPr>
               <w:pStyle w:val="TableParagraph"/>
-              <w:spacing w:before="187"/>
+              <w:spacing w:before="0"/>
               <w:rPr>
                 <w:rFonts w:ascii="Cambria"/>
                 <w:b/>
@@ -2417,70 +2287,16 @@
           </w:tcPr>
           <w:p>
             <w:pPr>
-              <w:pStyle w:val="font-claude-response-body"/>
-              <w:rPr>
-                <w:rFonts w:ascii="Georgia" w:hAnsi="Georgia"/>
-                <w:sz w:val="20"/>
-                <w:szCs w:val="20"/>
-              </w:rPr>
-            </w:pPr>
-            <w:r>
-              <w:rPr>
-                <w:rFonts w:ascii="Cambria" w:hAnsi="Cambria"/>
-                <w:b/>
-                <w:bCs/>
-                <w:sz w:val="20"/>
-              </w:rPr>
-              <w:t xml:space="preserve"> </w:t>
-            </w:r>
-            <w:r>
-              <w:rPr>
-                <w:rStyle w:val="Strong"/>
-                <w:rFonts w:ascii="Georgia" w:hAnsi="Georgia"/>
-                <w:sz w:val="20"/>
-                <w:szCs w:val="20"/>
-              </w:rPr>
-              <w:t>Programming Languages:</w:t>
-            </w:r>
-            <w:r>
-              <w:rPr>
-                <w:rFonts w:ascii="Georgia" w:hAnsi="Georgia"/>
-                <w:sz w:val="20"/>
-                <w:szCs w:val="20"/>
-              </w:rPr>
-              <w:t xml:space="preserve"> TypeScript, JavaScript, Python, PHP, Kotlin</w:t>
-            </w:r>
-          </w:p>
-          <w:p>
-            <w:pPr>
-              <w:pStyle w:val="font-claude-response-body"/>
-              <w:rPr>
-                <w:rFonts w:ascii="Georgia" w:hAnsi="Georgia"/>
-                <w:sz w:val="20"/>
-                <w:szCs w:val="20"/>
-              </w:rPr>
-            </w:pPr>
-            <w:r>
-              <w:rPr>
-                <w:rStyle w:val="Strong"/>
-                <w:rFonts w:ascii="Georgia" w:hAnsi="Georgia"/>
-                <w:sz w:val="20"/>
-                <w:szCs w:val="20"/>
-              </w:rPr>
-              <w:t>Web Development:</w:t>
-            </w:r>
-          </w:p>
-          <w:p>
-            <w:pPr>
               <w:pStyle w:val="TableParagraph"/>
               <w:numPr>
                 <w:ilvl w:val="0"/>
-                <w:numId w:val="3"/>
+                <w:numId w:val="2"/>
               </w:numPr>
               <w:tabs>
                 <w:tab w:val="left" w:pos="769"/>
               </w:tabs>
-              <w:spacing w:before="119"/>
+              <w:spacing w:before="0"/>
+              <w:ind w:left="769" w:hanging="359"/>
               <w:rPr>
                 <w:sz w:val="20"/>
                 <w:szCs w:val="20"/>
@@ -2491,103 +2307,7 @@
                 <w:sz w:val="20"/>
                 <w:szCs w:val="20"/>
               </w:rPr>
-              <w:t xml:space="preserve">Frontend: HTML5, CSS3, Tailwind CSS, </w:t>
-            </w:r>
-            <w:proofErr w:type="gramStart"/>
-            <w:r>
-              <w:rPr>
-                <w:sz w:val="20"/>
-                <w:szCs w:val="20"/>
-              </w:rPr>
-              <w:t>React</w:t>
-            </w:r>
-            <w:proofErr w:type="gramEnd"/>
-            <w:r>
-              <w:rPr>
-                <w:sz w:val="20"/>
-                <w:szCs w:val="20"/>
-              </w:rPr>
-              <w:t xml:space="preserve"> (</w:t>
-            </w:r>
-            <w:proofErr w:type="spellStart"/>
-            <w:r>
-              <w:rPr>
-                <w:sz w:val="20"/>
-                <w:szCs w:val="20"/>
-              </w:rPr>
-              <w:t>Vite</w:t>
-            </w:r>
-            <w:proofErr w:type="spellEnd"/>
-            <w:r>
-              <w:rPr>
-                <w:sz w:val="20"/>
-                <w:szCs w:val="20"/>
-              </w:rPr>
-              <w:t xml:space="preserve">), </w:t>
-            </w:r>
-            <w:proofErr w:type="spellStart"/>
-            <w:r>
-              <w:rPr>
-                <w:sz w:val="20"/>
-                <w:szCs w:val="20"/>
-              </w:rPr>
-              <w:t>shadcn</w:t>
-            </w:r>
-            <w:proofErr w:type="spellEnd"/>
-            <w:r>
-              <w:rPr>
-                <w:sz w:val="20"/>
-                <w:szCs w:val="20"/>
-              </w:rPr>
-              <w:t>/</w:t>
-            </w:r>
-            <w:proofErr w:type="spellStart"/>
-            <w:r>
-              <w:rPr>
-                <w:sz w:val="20"/>
-                <w:szCs w:val="20"/>
-              </w:rPr>
-              <w:t>ui</w:t>
-            </w:r>
-            <w:proofErr w:type="spellEnd"/>
-            <w:r>
-              <w:rPr>
-                <w:sz w:val="20"/>
-                <w:szCs w:val="20"/>
-              </w:rPr>
-              <w:t xml:space="preserve">, Radix UI, </w:t>
-            </w:r>
-            <w:proofErr w:type="spellStart"/>
-            <w:r>
-              <w:rPr>
-                <w:sz w:val="20"/>
-                <w:szCs w:val="20"/>
-              </w:rPr>
-              <w:t>Tabler</w:t>
-            </w:r>
-            <w:proofErr w:type="spellEnd"/>
-            <w:r>
-              <w:rPr>
-                <w:sz w:val="20"/>
-                <w:szCs w:val="20"/>
-              </w:rPr>
-              <w:t xml:space="preserve"> UI, </w:t>
-            </w:r>
-            <w:proofErr w:type="spellStart"/>
-            <w:r>
-              <w:rPr>
-                <w:sz w:val="20"/>
-                <w:szCs w:val="20"/>
-              </w:rPr>
-              <w:t>TanStack</w:t>
-            </w:r>
-            <w:proofErr w:type="spellEnd"/>
-            <w:r>
-              <w:rPr>
-                <w:sz w:val="20"/>
-                <w:szCs w:val="20"/>
-              </w:rPr>
-              <w:t xml:space="preserve"> Query, Framer Motion, GSAP, Recharts</w:t>
+              <w:t>Programming (TypeScript, JavaScript, Python, PHP, Kotlin)</w:t>
             </w:r>
           </w:p>
           <w:p>
@@ -2595,12 +2315,13 @@
               <w:pStyle w:val="TableParagraph"/>
               <w:numPr>
                 <w:ilvl w:val="0"/>
-                <w:numId w:val="3"/>
+                <w:numId w:val="2"/>
               </w:numPr>
               <w:tabs>
                 <w:tab w:val="left" w:pos="769"/>
               </w:tabs>
-              <w:spacing w:before="119"/>
+              <w:spacing w:before="0"/>
+              <w:ind w:left="769" w:hanging="359"/>
               <w:rPr>
                 <w:sz w:val="20"/>
                 <w:szCs w:val="20"/>
@@ -2611,7 +2332,7 @@
                 <w:sz w:val="20"/>
                 <w:szCs w:val="20"/>
               </w:rPr>
-              <w:t xml:space="preserve">Backend: Next.js, Laravel, </w:t>
+              <w:t xml:space="preserve">Web Development (React, Next.js, Laravel, </w:t>
             </w:r>
             <w:proofErr w:type="spellStart"/>
             <w:r>
@@ -2622,18 +2343,26 @@
               <w:t>FastAPI</w:t>
             </w:r>
             <w:proofErr w:type="spellEnd"/>
+            <w:r>
+              <w:rPr>
+                <w:sz w:val="20"/>
+                <w:szCs w:val="20"/>
+              </w:rPr>
+              <w:t>, Tailwind CSS, Bootstrap)</w:t>
+            </w:r>
           </w:p>
           <w:p>
             <w:pPr>
               <w:pStyle w:val="TableParagraph"/>
               <w:numPr>
                 <w:ilvl w:val="0"/>
-                <w:numId w:val="3"/>
+                <w:numId w:val="2"/>
               </w:numPr>
               <w:tabs>
                 <w:tab w:val="left" w:pos="769"/>
               </w:tabs>
-              <w:spacing w:before="119"/>
+              <w:spacing w:before="0"/>
+              <w:ind w:left="769" w:hanging="359"/>
               <w:rPr>
                 <w:sz w:val="20"/>
                 <w:szCs w:val="20"/>
@@ -2644,7 +2373,7 @@
                 <w:sz w:val="20"/>
                 <w:szCs w:val="20"/>
               </w:rPr>
-              <w:t>API &amp; Auth: REST API, JWT, Google OAuth, Session-based Authentication</w:t>
+              <w:t>Mobile (Android/Kotlin, Firebase, Room Database)</w:t>
             </w:r>
           </w:p>
           <w:p>
@@ -2652,12 +2381,13 @@
               <w:pStyle w:val="TableParagraph"/>
               <w:numPr>
                 <w:ilvl w:val="0"/>
-                <w:numId w:val="3"/>
+                <w:numId w:val="2"/>
               </w:numPr>
               <w:tabs>
                 <w:tab w:val="left" w:pos="769"/>
               </w:tabs>
-              <w:spacing w:before="119"/>
+              <w:spacing w:before="0"/>
+              <w:ind w:left="769" w:hanging="359"/>
               <w:rPr>
                 <w:sz w:val="20"/>
                 <w:szCs w:val="20"/>
@@ -2668,7 +2398,32 @@
                 <w:sz w:val="20"/>
                 <w:szCs w:val="20"/>
               </w:rPr>
-              <w:t xml:space="preserve">Third-Party API: Google Drive API, Gemini API, </w:t>
+              <w:t>Databases (PostgreSQL, MySQL, MongoDB) | ORM (Prisma, Eloquent)</w:t>
+            </w:r>
+          </w:p>
+          <w:p>
+            <w:pPr>
+              <w:pStyle w:val="TableParagraph"/>
+              <w:numPr>
+                <w:ilvl w:val="0"/>
+                <w:numId w:val="2"/>
+              </w:numPr>
+              <w:tabs>
+                <w:tab w:val="left" w:pos="769"/>
+              </w:tabs>
+              <w:spacing w:before="0"/>
+              <w:ind w:left="769" w:hanging="359"/>
+              <w:rPr>
+                <w:sz w:val="20"/>
+                <w:szCs w:val="20"/>
+              </w:rPr>
+            </w:pPr>
+            <w:r>
+              <w:rPr>
+                <w:sz w:val="20"/>
+                <w:szCs w:val="20"/>
+              </w:rPr>
+              <w:t xml:space="preserve">AI Integration (Gemini, </w:t>
             </w:r>
             <w:proofErr w:type="spellStart"/>
             <w:r>
@@ -2684,242 +2439,80 @@
                 <w:sz w:val="20"/>
                 <w:szCs w:val="20"/>
               </w:rPr>
-              <w:t xml:space="preserve"> API</w:t>
-            </w:r>
-          </w:p>
-          <w:p>
-            <w:pPr>
-              <w:pStyle w:val="font-claude-response-body"/>
-              <w:rPr>
-                <w:rFonts w:ascii="Georgia" w:hAnsi="Georgia"/>
+              <w:t>, OCR, Whisper)</w:t>
+            </w:r>
+          </w:p>
+          <w:p>
+            <w:pPr>
+              <w:pStyle w:val="TableParagraph"/>
+              <w:numPr>
+                <w:ilvl w:val="0"/>
+                <w:numId w:val="2"/>
+              </w:numPr>
+              <w:tabs>
+                <w:tab w:val="left" w:pos="769"/>
+              </w:tabs>
+              <w:spacing w:before="0"/>
+              <w:ind w:left="769" w:hanging="359"/>
+              <w:rPr>
                 <w:sz w:val="20"/>
                 <w:szCs w:val="20"/>
               </w:rPr>
             </w:pPr>
             <w:r>
               <w:rPr>
-                <w:rStyle w:val="Strong"/>
-                <w:rFonts w:ascii="Georgia" w:hAnsi="Georgia"/>
                 <w:sz w:val="20"/>
                 <w:szCs w:val="20"/>
               </w:rPr>
-              <w:t>Mobile Development:</w:t>
-            </w:r>
-            <w:r>
-              <w:rPr>
-                <w:rFonts w:ascii="Georgia" w:hAnsi="Georgia"/>
+              <w:t>Tools (Git, Docker, Linux, Figma</w:t>
+            </w:r>
+            <w:r>
+              <w:rPr>
                 <w:sz w:val="20"/>
                 <w:szCs w:val="20"/>
               </w:rPr>
-              <w:t xml:space="preserve"> Android (Kotlin), Firebase (Auth, Storage, </w:t>
+              <w:t xml:space="preserve">, Canva, </w:t>
             </w:r>
             <w:proofErr w:type="spellStart"/>
             <w:r>
               <w:rPr>
-                <w:rFonts w:ascii="Georgia" w:hAnsi="Georgia"/>
                 <w:sz w:val="20"/>
                 <w:szCs w:val="20"/>
               </w:rPr>
-              <w:t>Firestore</w:t>
+              <w:t>CapCut</w:t>
             </w:r>
             <w:proofErr w:type="spellEnd"/>
             <w:r>
               <w:rPr>
-                <w:rFonts w:ascii="Georgia" w:hAnsi="Georgia"/>
                 <w:sz w:val="20"/>
                 <w:szCs w:val="20"/>
               </w:rPr>
-              <w:t>), Room Database, SQLite</w:t>
-            </w:r>
-          </w:p>
-          <w:p>
-            <w:pPr>
-              <w:pStyle w:val="font-claude-response-body"/>
-              <w:rPr>
-                <w:rFonts w:ascii="Georgia" w:hAnsi="Georgia"/>
+              <w:t>)</w:t>
+            </w:r>
+          </w:p>
+          <w:p>
+            <w:pPr>
+              <w:pStyle w:val="TableParagraph"/>
+              <w:numPr>
+                <w:ilvl w:val="0"/>
+                <w:numId w:val="2"/>
+              </w:numPr>
+              <w:tabs>
+                <w:tab w:val="left" w:pos="769"/>
+              </w:tabs>
+              <w:spacing w:before="0"/>
+              <w:ind w:left="769" w:hanging="359"/>
+              <w:rPr>
                 <w:sz w:val="20"/>
                 <w:szCs w:val="20"/>
               </w:rPr>
             </w:pPr>
             <w:r>
               <w:rPr>
-                <w:rStyle w:val="Strong"/>
-                <w:rFonts w:ascii="Georgia" w:hAnsi="Georgia"/>
                 <w:sz w:val="20"/>
                 <w:szCs w:val="20"/>
               </w:rPr>
-              <w:t>AI &amp; Machine Learning:</w:t>
-            </w:r>
-            <w:r>
-              <w:rPr>
-                <w:rFonts w:ascii="Georgia" w:hAnsi="Georgia"/>
-                <w:sz w:val="20"/>
-                <w:szCs w:val="20"/>
-              </w:rPr>
-              <w:t xml:space="preserve"> AI SDK Integration, OCR (</w:t>
-            </w:r>
-            <w:proofErr w:type="spellStart"/>
-            <w:r>
-              <w:rPr>
-                <w:rFonts w:ascii="Georgia" w:hAnsi="Georgia"/>
-                <w:sz w:val="20"/>
-                <w:szCs w:val="20"/>
-              </w:rPr>
-              <w:t>surya</w:t>
-            </w:r>
-            <w:proofErr w:type="spellEnd"/>
-            <w:r>
-              <w:rPr>
-                <w:rFonts w:ascii="Georgia" w:hAnsi="Georgia"/>
-                <w:sz w:val="20"/>
-                <w:szCs w:val="20"/>
-              </w:rPr>
-              <w:t xml:space="preserve">-ai), Audio Transcription (Faster Whisper), LLM Integration (Gemini, </w:t>
-            </w:r>
-            <w:proofErr w:type="spellStart"/>
-            <w:r>
-              <w:rPr>
-                <w:rFonts w:ascii="Georgia" w:hAnsi="Georgia"/>
-                <w:sz w:val="20"/>
-                <w:szCs w:val="20"/>
-              </w:rPr>
-              <w:t>Groq</w:t>
-            </w:r>
-            <w:proofErr w:type="spellEnd"/>
-            <w:r>
-              <w:rPr>
-                <w:rFonts w:ascii="Georgia" w:hAnsi="Georgia"/>
-                <w:sz w:val="20"/>
-                <w:szCs w:val="20"/>
-              </w:rPr>
-              <w:t>)</w:t>
-            </w:r>
-          </w:p>
-          <w:p>
-            <w:pPr>
-              <w:pStyle w:val="font-claude-response-body"/>
-              <w:rPr>
-                <w:rFonts w:ascii="Georgia" w:hAnsi="Georgia"/>
-                <w:sz w:val="20"/>
-                <w:szCs w:val="20"/>
-              </w:rPr>
-            </w:pPr>
-            <w:r>
-              <w:rPr>
-                <w:rStyle w:val="Strong"/>
-                <w:rFonts w:ascii="Georgia" w:hAnsi="Georgia"/>
-                <w:sz w:val="20"/>
-                <w:szCs w:val="20"/>
-              </w:rPr>
-              <w:t>AI-Assisted Development:</w:t>
-            </w:r>
-            <w:r>
-              <w:rPr>
-                <w:rFonts w:ascii="Georgia" w:hAnsi="Georgia"/>
-                <w:sz w:val="20"/>
-                <w:szCs w:val="20"/>
-              </w:rPr>
-              <w:t xml:space="preserve"> Spec-Driven Development with AI Coding Agents (Claude Code, Cursor), Writing PRDs, Project Rules, and Architecture Docs for AI-Assisted Workflows</w:t>
-            </w:r>
-          </w:p>
-          <w:p>
-            <w:pPr>
-              <w:pStyle w:val="font-claude-response-body"/>
-              <w:rPr>
-                <w:rFonts w:ascii="Georgia" w:hAnsi="Georgia"/>
-                <w:sz w:val="20"/>
-                <w:szCs w:val="20"/>
-              </w:rPr>
-            </w:pPr>
-            <w:r>
-              <w:rPr>
-                <w:rStyle w:val="Strong"/>
-                <w:rFonts w:ascii="Georgia" w:hAnsi="Georgia"/>
-                <w:sz w:val="20"/>
-                <w:szCs w:val="20"/>
-              </w:rPr>
-              <w:t>Database:</w:t>
-            </w:r>
-            <w:r>
-              <w:rPr>
-                <w:rFonts w:ascii="Georgia" w:hAnsi="Georgia"/>
-                <w:sz w:val="20"/>
-                <w:szCs w:val="20"/>
-              </w:rPr>
-              <w:t xml:space="preserve"> PostgreSQL, MySQL, MariaDB, MongoDB | ORM: Prisma, Eloquent</w:t>
-            </w:r>
-          </w:p>
-          <w:p>
-            <w:pPr>
-              <w:pStyle w:val="font-claude-response-body"/>
-              <w:rPr>
-                <w:rFonts w:ascii="Georgia" w:hAnsi="Georgia"/>
-                <w:sz w:val="20"/>
-                <w:szCs w:val="20"/>
-              </w:rPr>
-            </w:pPr>
-            <w:r>
-              <w:rPr>
-                <w:rStyle w:val="Strong"/>
-                <w:rFonts w:ascii="Georgia" w:hAnsi="Georgia"/>
-                <w:sz w:val="20"/>
-                <w:szCs w:val="20"/>
-              </w:rPr>
-              <w:lastRenderedPageBreak/>
-              <w:t>Tools &amp; Technologies:</w:t>
-            </w:r>
-            <w:r>
-              <w:rPr>
-                <w:rFonts w:ascii="Georgia" w:hAnsi="Georgia"/>
-                <w:sz w:val="20"/>
-                <w:szCs w:val="20"/>
-              </w:rPr>
-              <w:t xml:space="preserve"> Git, GitHub, Docker, Linux (Ubuntu), </w:t>
-            </w:r>
-            <w:proofErr w:type="spellStart"/>
-            <w:r>
-              <w:rPr>
-                <w:rFonts w:ascii="Georgia" w:hAnsi="Georgia"/>
-                <w:sz w:val="20"/>
-                <w:szCs w:val="20"/>
-              </w:rPr>
-              <w:t>Vercel</w:t>
-            </w:r>
-            <w:proofErr w:type="spellEnd"/>
-            <w:r>
-              <w:rPr>
-                <w:rFonts w:ascii="Georgia" w:hAnsi="Georgia"/>
-                <w:sz w:val="20"/>
-                <w:szCs w:val="20"/>
-              </w:rPr>
-              <w:t>, Figma, Canva</w:t>
-            </w:r>
-          </w:p>
-          <w:p>
-            <w:pPr>
-              <w:pStyle w:val="font-claude-response-body"/>
-              <w:rPr>
-                <w:rFonts w:ascii="Georgia" w:hAnsi="Georgia"/>
-                <w:sz w:val="20"/>
-                <w:szCs w:val="20"/>
-              </w:rPr>
-            </w:pPr>
-            <w:r>
-              <w:rPr>
-                <w:rStyle w:val="Strong"/>
-                <w:rFonts w:ascii="Georgia" w:hAnsi="Georgia"/>
-                <w:sz w:val="20"/>
-                <w:szCs w:val="20"/>
-              </w:rPr>
-              <w:t>Software Engineering Concepts:</w:t>
-            </w:r>
-            <w:r>
-              <w:rPr>
-                <w:rFonts w:ascii="Georgia" w:hAnsi="Georgia"/>
-                <w:sz w:val="20"/>
-                <w:szCs w:val="20"/>
-              </w:rPr>
-              <w:t xml:space="preserve"> OOP, Data Structures &amp; Algorithms, MVC, Clean Architecture, MVVM &amp; Repository Pattern, Clean Code</w:t>
+              <w:t>Problem Solving, Clean Architecture, OOP, DSA</w:t>
             </w:r>
           </w:p>
         </w:tc>
@@ -2949,7 +2542,7 @@
       </w:tblGrid>
       <w:tr>
         <w:trPr>
-          <w:trHeight w:val="542"/>
+          <w:trHeight w:val="74"/>
         </w:trPr>
         <w:tc>
           <w:tcPr>
@@ -2958,24 +2551,24 @@
           <w:p>
             <w:pPr>
               <w:pStyle w:val="TableParagraph"/>
-              <w:spacing w:before="3"/>
+              <w:spacing w:before="0"/>
               <w:ind w:left="0"/>
               <w:rPr>
-                <w:rFonts w:ascii="Times New Roman"/>
+                <w:rFonts w:ascii="Cambria"/>
+                <w:b/>
                 <w:sz w:val="26"/>
               </w:rPr>
             </w:pPr>
-          </w:p>
-          <w:p>
-            <w:pPr>
-              <w:pStyle w:val="TableParagraph"/>
-              <w:spacing w:before="0"/>
-              <w:rPr>
-                <w:rFonts w:ascii="Cambria"/>
-                <w:b/>
+            <w:r>
+              <w:rPr>
+                <w:rFonts w:ascii="Cambria"/>
+                <w:b/>
+                <w:spacing w:val="-2"/>
+                <w:w w:val="105"/>
                 <w:sz w:val="26"/>
               </w:rPr>
-            </w:pPr>
+              <w:t xml:space="preserve"> </w:t>
+            </w:r>
             <w:r>
               <w:rPr>
                 <w:rFonts w:ascii="Cambria"/>
@@ -3011,7 +2604,7 @@
       </w:tr>
       <w:tr>
         <w:trPr>
-          <w:trHeight w:val="1024"/>
+          <w:trHeight w:val="524"/>
         </w:trPr>
         <w:tc>
           <w:tcPr>
@@ -3020,7 +2613,7 @@
           <w:p>
             <w:pPr>
               <w:pStyle w:val="TableParagraph"/>
-              <w:spacing w:before="146"/>
+              <w:spacing w:before="0"/>
               <w:rPr>
                 <w:sz w:val="20"/>
               </w:rPr>
@@ -3082,7 +2675,7 @@
           <w:p>
             <w:pPr>
               <w:pStyle w:val="TableParagraph"/>
-              <w:spacing w:before="22"/>
+              <w:spacing w:before="0"/>
               <w:rPr>
                 <w:rFonts w:ascii="Cambria"/>
                 <w:b/>
@@ -3203,6 +2796,7 @@
           <w:p>
             <w:pPr>
               <w:pStyle w:val="TableParagraph"/>
+              <w:spacing w:before="0"/>
               <w:rPr>
                 <w:i/>
                 <w:sz w:val="20"/>
@@ -3285,7 +2879,7 @@
       </w:tr>
       <w:tr>
         <w:trPr>
-          <w:trHeight w:val="789"/>
+          <w:trHeight w:val="406"/>
         </w:trPr>
         <w:tc>
           <w:tcPr>
@@ -3301,7 +2895,7 @@
               <w:tabs>
                 <w:tab w:val="left" w:pos="769"/>
               </w:tabs>
-              <w:spacing w:before="145"/>
+              <w:spacing w:before="0"/>
               <w:ind w:left="769" w:hanging="359"/>
               <w:rPr>
                 <w:sz w:val="20"/>
@@ -3521,7 +3115,7 @@
               <w:tabs>
                 <w:tab w:val="left" w:pos="769"/>
               </w:tabs>
-              <w:spacing w:before="127"/>
+              <w:spacing w:before="0"/>
               <w:ind w:left="769" w:hanging="359"/>
               <w:rPr>
                 <w:sz w:val="20"/>
@@ -3685,6 +3279,235 @@
                 <w:sz w:val="20"/>
               </w:rPr>
               <w:t>Student Organization Capacity Building Program</w:t>
+            </w:r>
+          </w:p>
+        </w:tc>
+      </w:tr>
+      <w:tr>
+        <w:trPr>
+          <w:trHeight w:val="289"/>
+        </w:trPr>
+        <w:tc>
+          <w:tcPr>
+            <w:tcW w:w="10773" w:type="dxa"/>
+          </w:tcPr>
+          <w:p>
+            <w:pPr>
+              <w:pStyle w:val="TableParagraph"/>
+              <w:spacing w:before="0"/>
+              <w:rPr>
+                <w:sz w:val="20"/>
+              </w:rPr>
+            </w:pPr>
+            <w:r>
+              <w:rPr>
+                <w:w w:val="105"/>
+                <w:sz w:val="20"/>
+              </w:rPr>
+              <w:t>General Secretary</w:t>
+            </w:r>
+          </w:p>
+          <w:p>
+            <w:pPr>
+              <w:pStyle w:val="TableParagraph"/>
+              <w:spacing w:before="0"/>
+              <w:rPr>
+                <w:rFonts w:ascii="Cambria"/>
+                <w:b/>
+                <w:sz w:val="20"/>
+              </w:rPr>
+            </w:pPr>
+            <w:r>
+              <w:rPr>
+                <w:rFonts w:ascii="Cambria"/>
+                <w:b/>
+                <w:spacing w:val="-2"/>
+                <w:w w:val="105"/>
+                <w:sz w:val="20"/>
+              </w:rPr>
+              <w:t>Informatics</w:t>
+            </w:r>
+            <w:r>
+              <w:rPr>
+                <w:rFonts w:ascii="Cambria"/>
+                <w:b/>
+                <w:spacing w:val="6"/>
+                <w:w w:val="105"/>
+                <w:sz w:val="20"/>
+              </w:rPr>
+              <w:t xml:space="preserve"> </w:t>
+            </w:r>
+            <w:r>
+              <w:rPr>
+                <w:rFonts w:ascii="Cambria"/>
+                <w:b/>
+                <w:spacing w:val="-2"/>
+                <w:w w:val="105"/>
+                <w:sz w:val="20"/>
+              </w:rPr>
+              <w:t>Student</w:t>
+            </w:r>
+            <w:r>
+              <w:rPr>
+                <w:rFonts w:ascii="Cambria"/>
+                <w:b/>
+                <w:spacing w:val="7"/>
+                <w:w w:val="105"/>
+                <w:sz w:val="20"/>
+              </w:rPr>
+              <w:t xml:space="preserve"> </w:t>
+            </w:r>
+            <w:r>
+              <w:rPr>
+                <w:rFonts w:ascii="Cambria"/>
+                <w:b/>
+                <w:spacing w:val="-2"/>
+                <w:w w:val="105"/>
+                <w:sz w:val="20"/>
+              </w:rPr>
+              <w:t>Association</w:t>
+            </w:r>
+            <w:r>
+              <w:rPr>
+                <w:rFonts w:ascii="Cambria"/>
+                <w:b/>
+                <w:spacing w:val="7"/>
+                <w:w w:val="105"/>
+                <w:sz w:val="20"/>
+              </w:rPr>
+              <w:t xml:space="preserve"> </w:t>
+            </w:r>
+            <w:r>
+              <w:rPr>
+                <w:rFonts w:ascii="Cambria"/>
+                <w:b/>
+                <w:spacing w:val="-2"/>
+                <w:w w:val="105"/>
+                <w:sz w:val="20"/>
+              </w:rPr>
+              <w:t>(AKPRIND</w:t>
+            </w:r>
+            <w:r>
+              <w:rPr>
+                <w:rFonts w:ascii="Cambria"/>
+                <w:b/>
+                <w:spacing w:val="6"/>
+                <w:w w:val="105"/>
+                <w:sz w:val="20"/>
+              </w:rPr>
+              <w:t xml:space="preserve"> </w:t>
+            </w:r>
+            <w:r>
+              <w:rPr>
+                <w:rFonts w:ascii="Cambria"/>
+                <w:b/>
+                <w:spacing w:val="-2"/>
+                <w:w w:val="105"/>
+                <w:sz w:val="20"/>
+              </w:rPr>
+              <w:t>University</w:t>
+            </w:r>
+            <w:r>
+              <w:rPr>
+                <w:rFonts w:ascii="Cambria"/>
+                <w:b/>
+                <w:spacing w:val="7"/>
+                <w:w w:val="105"/>
+                <w:sz w:val="20"/>
+              </w:rPr>
+              <w:t xml:space="preserve"> </w:t>
+            </w:r>
+            <w:r>
+              <w:rPr>
+                <w:rFonts w:ascii="Cambria"/>
+                <w:b/>
+                <w:spacing w:val="-2"/>
+                <w:w w:val="105"/>
+                <w:sz w:val="20"/>
+              </w:rPr>
+              <w:t>Indonesia)</w:t>
+            </w:r>
+          </w:p>
+          <w:p>
+            <w:pPr>
+              <w:pStyle w:val="TableParagraph"/>
+              <w:spacing w:before="0"/>
+              <w:rPr>
+                <w:i/>
+                <w:sz w:val="20"/>
+              </w:rPr>
+            </w:pPr>
+            <w:r>
+              <w:rPr>
+                <w:i/>
+                <w:spacing w:val="-6"/>
+                <w:sz w:val="20"/>
+              </w:rPr>
+              <w:t>January</w:t>
+            </w:r>
+            <w:r>
+              <w:rPr>
+                <w:i/>
+                <w:spacing w:val="1"/>
+                <w:sz w:val="20"/>
+              </w:rPr>
+              <w:t xml:space="preserve"> </w:t>
+            </w:r>
+            <w:r>
+              <w:rPr>
+                <w:i/>
+                <w:spacing w:val="-6"/>
+                <w:sz w:val="20"/>
+              </w:rPr>
+              <w:t>2025</w:t>
+            </w:r>
+            <w:r>
+              <w:rPr>
+                <w:i/>
+                <w:spacing w:val="-6"/>
+                <w:sz w:val="20"/>
+              </w:rPr>
+              <w:t xml:space="preserve"> </w:t>
+            </w:r>
+            <w:r>
+              <w:rPr>
+                <w:i/>
+                <w:spacing w:val="-6"/>
+                <w:sz w:val="20"/>
+              </w:rPr>
+              <w:t>–</w:t>
+            </w:r>
+            <w:r>
+              <w:rPr>
+                <w:i/>
+                <w:spacing w:val="-6"/>
+                <w:sz w:val="20"/>
+              </w:rPr>
+              <w:t xml:space="preserve"> </w:t>
+            </w:r>
+            <w:r>
+              <w:rPr>
+                <w:i/>
+                <w:spacing w:val="-6"/>
+                <w:sz w:val="20"/>
+              </w:rPr>
+              <w:t>February</w:t>
+            </w:r>
+            <w:r>
+              <w:rPr>
+                <w:i/>
+                <w:spacing w:val="1"/>
+                <w:sz w:val="20"/>
+              </w:rPr>
+              <w:t xml:space="preserve"> </w:t>
+            </w:r>
+            <w:r>
+              <w:rPr>
+                <w:i/>
+                <w:spacing w:val="-6"/>
+                <w:sz w:val="20"/>
+              </w:rPr>
+              <w:t>2026</w:t>
             </w:r>
           </w:p>
         </w:tc>
@@ -3700,234 +3523,6 @@
           <w:p>
             <w:pPr>
               <w:pStyle w:val="TableParagraph"/>
-              <w:spacing w:before="146"/>
-              <w:rPr>
-                <w:sz w:val="20"/>
-              </w:rPr>
-            </w:pPr>
-            <w:r>
-              <w:rPr>
-                <w:w w:val="105"/>
-                <w:sz w:val="20"/>
-              </w:rPr>
-              <w:t>General Secretary</w:t>
-            </w:r>
-          </w:p>
-          <w:p>
-            <w:pPr>
-              <w:pStyle w:val="TableParagraph"/>
-              <w:spacing w:before="22"/>
-              <w:rPr>
-                <w:rFonts w:ascii="Cambria"/>
-                <w:b/>
-                <w:sz w:val="20"/>
-              </w:rPr>
-            </w:pPr>
-            <w:r>
-              <w:rPr>
-                <w:rFonts w:ascii="Cambria"/>
-                <w:b/>
-                <w:spacing w:val="-2"/>
-                <w:w w:val="105"/>
-                <w:sz w:val="20"/>
-              </w:rPr>
-              <w:t>Informatics</w:t>
-            </w:r>
-            <w:r>
-              <w:rPr>
-                <w:rFonts w:ascii="Cambria"/>
-                <w:b/>
-                <w:spacing w:val="6"/>
-                <w:w w:val="105"/>
-                <w:sz w:val="20"/>
-              </w:rPr>
-              <w:t xml:space="preserve"> </w:t>
-            </w:r>
-            <w:r>
-              <w:rPr>
-                <w:rFonts w:ascii="Cambria"/>
-                <w:b/>
-                <w:spacing w:val="-2"/>
-                <w:w w:val="105"/>
-                <w:sz w:val="20"/>
-              </w:rPr>
-              <w:t>Student</w:t>
-            </w:r>
-            <w:r>
-              <w:rPr>
-                <w:rFonts w:ascii="Cambria"/>
-                <w:b/>
-                <w:spacing w:val="7"/>
-                <w:w w:val="105"/>
-                <w:sz w:val="20"/>
-              </w:rPr>
-              <w:t xml:space="preserve"> </w:t>
-            </w:r>
-            <w:r>
-              <w:rPr>
-                <w:rFonts w:ascii="Cambria"/>
-                <w:b/>
-                <w:spacing w:val="-2"/>
-                <w:w w:val="105"/>
-                <w:sz w:val="20"/>
-              </w:rPr>
-              <w:t>Association</w:t>
-            </w:r>
-            <w:r>
-              <w:rPr>
-                <w:rFonts w:ascii="Cambria"/>
-                <w:b/>
-                <w:spacing w:val="7"/>
-                <w:w w:val="105"/>
-                <w:sz w:val="20"/>
-              </w:rPr>
-              <w:t xml:space="preserve"> </w:t>
-            </w:r>
-            <w:r>
-              <w:rPr>
-                <w:rFonts w:ascii="Cambria"/>
-                <w:b/>
-                <w:spacing w:val="-2"/>
-                <w:w w:val="105"/>
-                <w:sz w:val="20"/>
-              </w:rPr>
-              <w:t>(AKPRIND</w:t>
-            </w:r>
-            <w:r>
-              <w:rPr>
-                <w:rFonts w:ascii="Cambria"/>
-                <w:b/>
-                <w:spacing w:val="6"/>
-                <w:w w:val="105"/>
-                <w:sz w:val="20"/>
-              </w:rPr>
-              <w:t xml:space="preserve"> </w:t>
-            </w:r>
-            <w:r>
-              <w:rPr>
-                <w:rFonts w:ascii="Cambria"/>
-                <w:b/>
-                <w:spacing w:val="-2"/>
-                <w:w w:val="105"/>
-                <w:sz w:val="20"/>
-              </w:rPr>
-              <w:t>University</w:t>
-            </w:r>
-            <w:r>
-              <w:rPr>
-                <w:rFonts w:ascii="Cambria"/>
-                <w:b/>
-                <w:spacing w:val="7"/>
-                <w:w w:val="105"/>
-                <w:sz w:val="20"/>
-              </w:rPr>
-              <w:t xml:space="preserve"> </w:t>
-            </w:r>
-            <w:r>
-              <w:rPr>
-                <w:rFonts w:ascii="Cambria"/>
-                <w:b/>
-                <w:spacing w:val="-2"/>
-                <w:w w:val="105"/>
-                <w:sz w:val="20"/>
-              </w:rPr>
-              <w:t>Indonesia)</w:t>
-            </w:r>
-          </w:p>
-          <w:p>
-            <w:pPr>
-              <w:pStyle w:val="TableParagraph"/>
-              <w:rPr>
-                <w:i/>
-                <w:sz w:val="20"/>
-              </w:rPr>
-            </w:pPr>
-            <w:r>
-              <w:rPr>
-                <w:i/>
-                <w:spacing w:val="-6"/>
-                <w:sz w:val="20"/>
-              </w:rPr>
-              <w:t>January</w:t>
-            </w:r>
-            <w:r>
-              <w:rPr>
-                <w:i/>
-                <w:spacing w:val="1"/>
-                <w:sz w:val="20"/>
-              </w:rPr>
-              <w:t xml:space="preserve"> </w:t>
-            </w:r>
-            <w:r>
-              <w:rPr>
-                <w:i/>
-                <w:spacing w:val="-6"/>
-                <w:sz w:val="20"/>
-              </w:rPr>
-              <w:t>2025</w:t>
-            </w:r>
-            <w:r>
-              <w:rPr>
-                <w:i/>
-                <w:spacing w:val="-6"/>
-                <w:sz w:val="20"/>
-              </w:rPr>
-              <w:t xml:space="preserve"> </w:t>
-            </w:r>
-            <w:r>
-              <w:rPr>
-                <w:i/>
-                <w:spacing w:val="-6"/>
-                <w:sz w:val="20"/>
-              </w:rPr>
-              <w:t>–</w:t>
-            </w:r>
-            <w:r>
-              <w:rPr>
-                <w:i/>
-                <w:spacing w:val="-6"/>
-                <w:sz w:val="20"/>
-              </w:rPr>
-              <w:t xml:space="preserve"> </w:t>
-            </w:r>
-            <w:r>
-              <w:rPr>
-                <w:i/>
-                <w:spacing w:val="-6"/>
-                <w:sz w:val="20"/>
-              </w:rPr>
-              <w:t>February</w:t>
-            </w:r>
-            <w:r>
-              <w:rPr>
-                <w:i/>
-                <w:spacing w:val="1"/>
-                <w:sz w:val="20"/>
-              </w:rPr>
-              <w:t xml:space="preserve"> </w:t>
-            </w:r>
-            <w:r>
-              <w:rPr>
-                <w:i/>
-                <w:spacing w:val="-6"/>
-                <w:sz w:val="20"/>
-              </w:rPr>
-              <w:t>2026</w:t>
-            </w:r>
-          </w:p>
-        </w:tc>
-      </w:tr>
-      <w:tr>
-        <w:trPr>
-          <w:trHeight w:val="817"/>
-        </w:trPr>
-        <w:tc>
-          <w:tcPr>
-            <w:tcW w:w="10773" w:type="dxa"/>
-          </w:tcPr>
-          <w:p>
-            <w:pPr>
-              <w:pStyle w:val="TableParagraph"/>
               <w:numPr>
                 <w:ilvl w:val="0"/>
                 <w:numId w:val="2"/>
@@ -3935,7 +3530,7 @@
               <w:tabs>
                 <w:tab w:val="left" w:pos="769"/>
               </w:tabs>
-              <w:spacing w:before="145"/>
+              <w:spacing w:before="0"/>
               <w:ind w:left="769" w:hanging="359"/>
               <w:rPr>
                 <w:sz w:val="20"/>
@@ -3958,7 +3553,7 @@
               <w:tabs>
                 <w:tab w:val="left" w:pos="769"/>
               </w:tabs>
-              <w:spacing w:before="145"/>
+              <w:spacing w:before="0"/>
               <w:ind w:left="769" w:hanging="359"/>
               <w:rPr>
                 <w:sz w:val="20"/>
@@ -3981,7 +3576,7 @@
               <w:tabs>
                 <w:tab w:val="left" w:pos="769"/>
               </w:tabs>
-              <w:spacing w:before="145"/>
+              <w:spacing w:before="0"/>
               <w:ind w:left="769" w:hanging="359"/>
               <w:rPr>
                 <w:sz w:val="20"/>
@@ -4004,7 +3599,7 @@
               <w:tabs>
                 <w:tab w:val="left" w:pos="769"/>
               </w:tabs>
-              <w:spacing w:before="145"/>
+              <w:spacing w:before="0"/>
               <w:ind w:left="769" w:hanging="359"/>
               <w:rPr>
                 <w:sz w:val="20"/>
@@ -4020,14 +3615,6 @@
         </w:tc>
       </w:tr>
     </w:tbl>
-    <w:p>
-      <w:pPr>
-        <w:rPr>
-          <w:sz w:val="10"/>
-          <w:szCs w:val="10"/>
-        </w:rPr>
-      </w:pPr>
-    </w:p>
     <w:p>
       <w:pPr>
         <w:rPr>
@@ -4103,7 +3690,7 @@
               <w:tabs>
                 <w:tab w:val="left" w:pos="769"/>
               </w:tabs>
-              <w:spacing w:before="145"/>
+              <w:spacing w:before="0"/>
               <w:rPr>
                 <w:sz w:val="20"/>
               </w:rPr>
@@ -4235,7 +3822,7 @@
               <w:tabs>
                 <w:tab w:val="left" w:pos="769"/>
               </w:tabs>
-              <w:spacing w:before="145"/>
+              <w:spacing w:before="0"/>
               <w:ind w:left="769" w:hanging="359"/>
               <w:rPr>
                 <w:sz w:val="20"/>
@@ -4258,7 +3845,7 @@
               <w:tabs>
                 <w:tab w:val="left" w:pos="769"/>
               </w:tabs>
-              <w:spacing w:before="145"/>
+              <w:spacing w:before="0"/>
               <w:ind w:left="769" w:hanging="359"/>
               <w:rPr>
                 <w:sz w:val="20"/>
@@ -4307,7 +3894,7 @@
               <w:tabs>
                 <w:tab w:val="left" w:pos="769"/>
               </w:tabs>
-              <w:spacing w:before="145"/>
+              <w:spacing w:before="0"/>
               <w:ind w:left="0"/>
               <w:rPr>
                 <w:sz w:val="20"/>
@@ -4329,7 +3916,7 @@
           <w:p>
             <w:pPr>
               <w:pStyle w:val="TableParagraph"/>
-              <w:spacing w:before="22"/>
+              <w:spacing w:before="0"/>
               <w:rPr>
                 <w:rFonts w:ascii="Cambria"/>
                 <w:b/>
@@ -4413,7 +4000,7 @@
               <w:tabs>
                 <w:tab w:val="left" w:pos="769"/>
               </w:tabs>
-              <w:spacing w:before="145"/>
+              <w:spacing w:before="0"/>
               <w:rPr>
                 <w:sz w:val="20"/>
               </w:rPr>
@@ -4465,7 +4052,7 @@
       </w:tr>
       <w:tr>
         <w:trPr>
-          <w:trHeight w:val="1481"/>
+          <w:trHeight w:val="74"/>
         </w:trPr>
         <w:tc>
           <w:tcPr>
@@ -4481,7 +4068,7 @@
               <w:tabs>
                 <w:tab w:val="left" w:pos="769"/>
               </w:tabs>
-              <w:spacing w:before="145"/>
+              <w:spacing w:before="0"/>
               <w:ind w:left="769" w:hanging="359"/>
               <w:rPr>
                 <w:sz w:val="20"/>
@@ -4504,7 +4091,7 @@
               <w:tabs>
                 <w:tab w:val="left" w:pos="769"/>
               </w:tabs>
-              <w:spacing w:before="145"/>
+              <w:spacing w:before="0"/>
               <w:ind w:left="769" w:hanging="359"/>
               <w:rPr>
                 <w:sz w:val="20"/>
@@ -4527,7 +4114,7 @@
               <w:tabs>
                 <w:tab w:val="left" w:pos="769"/>
               </w:tabs>
-              <w:spacing w:before="145"/>
+              <w:spacing w:before="0"/>
               <w:ind w:left="769" w:hanging="359"/>
               <w:rPr>
                 <w:sz w:val="20"/>
@@ -4590,7 +4177,7 @@
           <w:p>
             <w:pPr>
               <w:pStyle w:val="TableParagraph"/>
-              <w:spacing w:before="192"/>
+              <w:spacing w:before="0"/>
               <w:rPr>
                 <w:rFonts w:ascii="Cambria"/>
                 <w:b/>
@@ -4621,7 +4208,7 @@
           <w:p>
             <w:pPr>
               <w:pStyle w:val="TableParagraph"/>
-              <w:spacing w:before="126"/>
+              <w:spacing w:before="0"/>
               <w:rPr>
                 <w:rFonts w:ascii="Cambria"/>
                 <w:b/>
@@ -4731,7 +4318,7 @@
           <w:p>
             <w:pPr>
               <w:pStyle w:val="TableParagraph"/>
-              <w:spacing w:before="77"/>
+              <w:spacing w:before="0"/>
               <w:rPr>
                 <w:spacing w:val="-2"/>
                 <w:w w:val="105"/>
@@ -4810,7 +4397,7 @@
           <w:p>
             <w:pPr>
               <w:pStyle w:val="TableParagraph"/>
-              <w:spacing w:before="77"/>
+              <w:spacing w:before="0"/>
               <w:rPr>
                 <w:i/>
                 <w:spacing w:val="-2"/>
@@ -4882,7 +4469,7 @@
           <w:p>
             <w:pPr>
               <w:pStyle w:val="TableParagraph"/>
-              <w:spacing w:before="77"/>
+              <w:spacing w:before="0"/>
               <w:rPr>
                 <w:iCs/>
                 <w:spacing w:val="-2"/>
@@ -4901,7 +4488,7 @@
           <w:p>
             <w:pPr>
               <w:pStyle w:val="TableParagraph"/>
-              <w:spacing w:before="77"/>
+              <w:spacing w:before="0"/>
               <w:rPr>
                 <w:sz w:val="20"/>
               </w:rPr>

</xml_diff>

<commit_message>
docs: update resume files with latest information
</commit_message>
<xml_diff>
--- a/public/resume/Ahmad_Rizal_Resume.docx
+++ b/public/resume/Ahmad_Rizal_Resume.docx
@@ -839,7 +839,15 @@
                 <w:spacing w:val="-4"/>
                 <w:sz w:val="20"/>
               </w:rPr>
-              <w:t xml:space="preserve"> 2026</w:t>
+              <w:t xml:space="preserve"> 202</w:t>
+            </w:r>
+            <w:r>
+              <w:rPr>
+                <w:i/>
+                <w:spacing w:val="-4"/>
+                <w:sz w:val="20"/>
+              </w:rPr>
+              <w:t>5</w:t>
             </w:r>
           </w:p>
         </w:tc>
@@ -1051,19 +1059,7 @@
                 <w:rPr>
                   <w:rStyle w:val="Hyperlink"/>
                 </w:rPr>
-                <w:t>github.com/ahmadrizal1st/mo</w:t>
-              </w:r>
-              <w:r>
-                <w:rPr>
-                  <w:rStyle w:val="Hyperlink"/>
-                </w:rPr>
-                <w:t>r</w:t>
-              </w:r>
-              <w:r>
-                <w:rPr>
-                  <w:rStyle w:val="Hyperlink"/>
-                </w:rPr>
-                <w:t>a</w:t>
+                <w:t>github.com/ahmadrizal1st/mora</w:t>
               </w:r>
             </w:hyperlink>
           </w:p>
@@ -1134,16 +1130,8 @@
               <w:rPr>
                 <w:sz w:val="20"/>
               </w:rPr>
-              <w:t xml:space="preserve">) via AI SDK for intelligent financial </w:t>
-            </w:r>
-            <w:proofErr w:type="spellStart"/>
-            <w:r>
-              <w:rPr>
-                <w:sz w:val="20"/>
-              </w:rPr>
-              <w:t>insights</w:t>
-            </w:r>
-            <w:proofErr w:type="spellEnd"/>
+              <w:t>) via AI SDK for intelligent financial insights</w:t>
+            </w:r>
           </w:p>
           <w:p>
             <w:pPr>

</xml_diff>